<commit_message>
CF: Drupal core and contrib updates; whole lot more little tweaks for permissions and adding the 'Races' menu item for all Race Day users.
</commit_message>
<xml_diff>
--- a/race_day_permissions.docx
+++ b/race_day_permissions.docx
@@ -1457,6 +1457,148 @@
               <w:right w:val="single" w:color="CCCCCC" w:sz="1"/>
             </w:tcBorders>
             <w:shd w:fill="FFFFFF" w:val="clear"/>
+            <w:tcMar>
+              <w:top w:type="dxa" w:w="80"/>
+              <w:left w:type="dxa" w:w="120"/>
+              <w:bottom w:type="dxa" w:w="80"/>
+              <w:right w:type="dxa" w:w="120"/>
+            </w:tcMar>
+            <w:vAlign w:val="center"/>
+          </w:tcPr>
+          <w:p>
+            <w:pPr>
+              <w:jc w:val="center"/>
+            </w:pPr>
+            <w:r>
+              <w:rPr>
+                <w:rFonts w:ascii="Arial" w:cs="Arial" w:eastAsia="Arial" w:hAnsi="Arial"/>
+                <w:b/>
+                <w:bCs/>
+                <w:color w:val="1F7023"/>
+                <w:sz w:val="20"/>
+                <w:szCs w:val="20"/>
+              </w:rPr>
+              <w:t xml:space="preserve">✓</w:t>
+            </w:r>
+          </w:p>
+        </w:tc>
+      </w:tr>
+      <w:tr>
+        <w:tc>
+          <w:tcPr>
+            <w:tcW w:type="dxa" w:w="5220"/>
+            <w:tcBorders>
+              <w:top w:val="single" w:color="CCCCCC" w:sz="1"/>
+              <w:left w:val="single" w:color="CCCCCC" w:sz="1"/>
+              <w:bottom w:val="single" w:color="CCCCCC" w:sz="1"/>
+              <w:right w:val="single" w:color="CCCCCC" w:sz="1"/>
+            </w:tcBorders>
+            <w:shd w:fill="DEEAF1" w:val="clear"/>
+            <w:tcMar>
+              <w:top w:type="dxa" w:w="80"/>
+              <w:left w:type="dxa" w:w="120"/>
+              <w:bottom w:type="dxa" w:w="80"/>
+              <w:right w:type="dxa" w:w="120"/>
+            </w:tcMar>
+            <w:vAlign w:val="center"/>
+          </w:tcPr>
+          <w:p>
+            <w:pPr>
+              <w:jc w:val="left"/>
+            </w:pPr>
+            <w:r>
+              <w:rPr>
+                <w:rFonts w:ascii="Arial" w:cs="Arial" w:eastAsia="Arial" w:hAnsi="Arial"/>
+                <w:b w:val="false"/>
+                <w:bCs w:val="false"/>
+                <w:color w:val="000000"/>
+                <w:sz w:val="20"/>
+                <w:szCs w:val="20"/>
+              </w:rPr>
+              <w:t xml:space="preserve">View Race Day races admin listing</w:t>
+            </w:r>
+          </w:p>
+        </w:tc>
+        <w:tc>
+          <w:tcPr>
+            <w:tcW w:type="dxa" w:w="2820"/>
+            <w:tcBorders>
+              <w:top w:val="single" w:color="CCCCCC" w:sz="1"/>
+              <w:left w:val="single" w:color="CCCCCC" w:sz="1"/>
+              <w:bottom w:val="single" w:color="CCCCCC" w:sz="1"/>
+              <w:right w:val="single" w:color="CCCCCC" w:sz="1"/>
+            </w:tcBorders>
+            <w:shd w:fill="DEEAF1" w:val="clear"/>
+            <w:tcMar>
+              <w:top w:type="dxa" w:w="80"/>
+              <w:left w:type="dxa" w:w="120"/>
+              <w:bottom w:type="dxa" w:w="80"/>
+              <w:right w:type="dxa" w:w="120"/>
+            </w:tcMar>
+            <w:vAlign w:val="center"/>
+          </w:tcPr>
+          <w:p>
+            <w:pPr>
+              <w:jc w:val="center"/>
+            </w:pPr>
+            <w:r>
+              <w:rPr>
+                <w:rFonts w:ascii="Arial" w:cs="Arial" w:eastAsia="Arial" w:hAnsi="Arial"/>
+                <w:b/>
+                <w:bCs/>
+                <w:color w:val="1F7023"/>
+                <w:sz w:val="20"/>
+                <w:szCs w:val="20"/>
+              </w:rPr>
+              <w:t xml:space="preserve">✓</w:t>
+            </w:r>
+          </w:p>
+        </w:tc>
+        <w:tc>
+          <w:tcPr>
+            <w:tcW w:type="dxa" w:w="2820"/>
+            <w:tcBorders>
+              <w:top w:val="single" w:color="CCCCCC" w:sz="1"/>
+              <w:left w:val="single" w:color="CCCCCC" w:sz="1"/>
+              <w:bottom w:val="single" w:color="CCCCCC" w:sz="1"/>
+              <w:right w:val="single" w:color="CCCCCC" w:sz="1"/>
+            </w:tcBorders>
+            <w:shd w:fill="DEEAF1" w:val="clear"/>
+            <w:tcMar>
+              <w:top w:type="dxa" w:w="80"/>
+              <w:left w:type="dxa" w:w="120"/>
+              <w:bottom w:type="dxa" w:w="80"/>
+              <w:right w:type="dxa" w:w="120"/>
+            </w:tcMar>
+            <w:vAlign w:val="center"/>
+          </w:tcPr>
+          <w:p>
+            <w:pPr>
+              <w:jc w:val="center"/>
+            </w:pPr>
+            <w:r>
+              <w:rPr>
+                <w:rFonts w:ascii="Arial" w:cs="Arial" w:eastAsia="Arial" w:hAnsi="Arial"/>
+                <w:b/>
+                <w:bCs/>
+                <w:color w:val="1F7023"/>
+                <w:sz w:val="20"/>
+                <w:szCs w:val="20"/>
+              </w:rPr>
+              <w:t xml:space="preserve">✓</w:t>
+            </w:r>
+          </w:p>
+        </w:tc>
+        <w:tc>
+          <w:tcPr>
+            <w:tcW w:type="dxa" w:w="2820"/>
+            <w:tcBorders>
+              <w:top w:val="single" w:color="CCCCCC" w:sz="1"/>
+              <w:left w:val="single" w:color="CCCCCC" w:sz="1"/>
+              <w:bottom w:val="single" w:color="CCCCCC" w:sz="1"/>
+              <w:right w:val="single" w:color="CCCCCC" w:sz="1"/>
+            </w:tcBorders>
+            <w:shd w:fill="DEEAF1" w:val="clear"/>
             <w:tcMar>
               <w:top w:type="dxa" w:w="80"/>
               <w:left w:type="dxa" w:w="120"/>
@@ -3295,6 +3437,183 @@
               <w:right w:val="single" w:color="CCCCCC" w:sz="1"/>
             </w:tcBorders>
             <w:shd w:fill="FFFFFF" w:val="clear"/>
+            <w:tcMar>
+              <w:top w:type="dxa" w:w="80"/>
+              <w:left w:type="dxa" w:w="120"/>
+              <w:bottom w:type="dxa" w:w="80"/>
+              <w:right w:type="dxa" w:w="120"/>
+            </w:tcMar>
+            <w:vAlign w:val="center"/>
+          </w:tcPr>
+          <w:p>
+            <w:pPr>
+              <w:jc w:val="center"/>
+            </w:pPr>
+            <w:r>
+              <w:rPr>
+                <w:rFonts w:ascii="Arial" w:cs="Arial" w:eastAsia="Arial" w:hAnsi="Arial"/>
+                <w:b/>
+                <w:bCs/>
+                <w:color w:val="1F7023"/>
+                <w:sz w:val="20"/>
+                <w:szCs w:val="20"/>
+              </w:rPr>
+              <w:t xml:space="preserve">✓</w:t>
+            </w:r>
+          </w:p>
+        </w:tc>
+      </w:tr>
+      <w:tr>
+        <w:tc>
+          <w:tcPr>
+            <w:tcW w:type="dxa" w:w="3000"/>
+            <w:tcBorders>
+              <w:top w:val="single" w:color="CCCCCC" w:sz="1"/>
+              <w:left w:val="single" w:color="CCCCCC" w:sz="1"/>
+              <w:bottom w:val="single" w:color="CCCCCC" w:sz="1"/>
+              <w:right w:val="single" w:color="CCCCCC" w:sz="1"/>
+            </w:tcBorders>
+            <w:shd w:fill="DEEAF1" w:val="clear"/>
+            <w:tcMar>
+              <w:top w:type="dxa" w:w="80"/>
+              <w:left w:type="dxa" w:w="120"/>
+              <w:bottom w:type="dxa" w:w="80"/>
+              <w:right w:type="dxa" w:w="120"/>
+            </w:tcMar>
+            <w:vAlign w:val="center"/>
+          </w:tcPr>
+          <w:p>
+            <w:pPr>
+              <w:jc w:val="left"/>
+            </w:pPr>
+            <w:r>
+              <w:rPr>
+                <w:rFonts w:ascii="Arial" w:cs="Arial" w:eastAsia="Arial" w:hAnsi="Arial"/>
+                <w:b/>
+                <w:bCs/>
+                <w:color w:val="000000"/>
+                <w:sz w:val="20"/>
+                <w:szCs w:val="20"/>
+              </w:rPr>
+              <w:t xml:space="preserve">View Race Day races admin listing</w:t>
+            </w:r>
+          </w:p>
+        </w:tc>
+        <w:tc>
+          <w:tcPr>
+            <w:tcW w:type="dxa" w:w="4800"/>
+            <w:tcBorders>
+              <w:top w:val="single" w:color="CCCCCC" w:sz="1"/>
+              <w:left w:val="single" w:color="CCCCCC" w:sz="1"/>
+              <w:bottom w:val="single" w:color="CCCCCC" w:sz="1"/>
+              <w:right w:val="single" w:color="CCCCCC" w:sz="1"/>
+            </w:tcBorders>
+            <w:shd w:fill="DEEAF1" w:val="clear"/>
+            <w:tcMar>
+              <w:top w:type="dxa" w:w="80"/>
+              <w:left w:type="dxa" w:w="120"/>
+              <w:bottom w:type="dxa" w:w="80"/>
+              <w:right w:type="dxa" w:w="120"/>
+            </w:tcMar>
+            <w:vAlign w:val="center"/>
+          </w:tcPr>
+          <w:p>
+            <w:pPr>
+              <w:jc w:val="left"/>
+            </w:pPr>
+            <w:r>
+              <w:rPr>
+                <w:rFonts w:ascii="Arial" w:cs="Arial" w:eastAsia="Arial" w:hAnsi="Arial"/>
+                <w:b w:val="false"/>
+                <w:bCs w:val="false"/>
+                <w:color w:val="000000"/>
+                <w:sz w:val="20"/>
+                <w:szCs w:val="20"/>
+              </w:rPr>
+              <w:t xml:space="preserve">View the admin listing of all races, without the ability to create, edit, or delete them.</w:t>
+            </w:r>
+          </w:p>
+        </w:tc>
+        <w:tc>
+          <w:tcPr>
+            <w:tcW w:type="dxa" w:w="1960"/>
+            <w:tcBorders>
+              <w:top w:val="single" w:color="CCCCCC" w:sz="1"/>
+              <w:left w:val="single" w:color="CCCCCC" w:sz="1"/>
+              <w:bottom w:val="single" w:color="CCCCCC" w:sz="1"/>
+              <w:right w:val="single" w:color="CCCCCC" w:sz="1"/>
+            </w:tcBorders>
+            <w:shd w:fill="DEEAF1" w:val="clear"/>
+            <w:tcMar>
+              <w:top w:type="dxa" w:w="80"/>
+              <w:left w:type="dxa" w:w="120"/>
+              <w:bottom w:type="dxa" w:w="80"/>
+              <w:right w:type="dxa" w:w="120"/>
+            </w:tcMar>
+            <w:vAlign w:val="center"/>
+          </w:tcPr>
+          <w:p>
+            <w:pPr>
+              <w:jc w:val="center"/>
+            </w:pPr>
+            <w:r>
+              <w:rPr>
+                <w:rFonts w:ascii="Arial" w:cs="Arial" w:eastAsia="Arial" w:hAnsi="Arial"/>
+                <w:b/>
+                <w:bCs/>
+                <w:color w:val="1F7023"/>
+                <w:sz w:val="20"/>
+                <w:szCs w:val="20"/>
+              </w:rPr>
+              <w:t xml:space="preserve">✓</w:t>
+            </w:r>
+          </w:p>
+        </w:tc>
+        <w:tc>
+          <w:tcPr>
+            <w:tcW w:type="dxa" w:w="1960"/>
+            <w:tcBorders>
+              <w:top w:val="single" w:color="CCCCCC" w:sz="1"/>
+              <w:left w:val="single" w:color="CCCCCC" w:sz="1"/>
+              <w:bottom w:val="single" w:color="CCCCCC" w:sz="1"/>
+              <w:right w:val="single" w:color="CCCCCC" w:sz="1"/>
+            </w:tcBorders>
+            <w:shd w:fill="DEEAF1" w:val="clear"/>
+            <w:tcMar>
+              <w:top w:type="dxa" w:w="80"/>
+              <w:left w:type="dxa" w:w="120"/>
+              <w:bottom w:type="dxa" w:w="80"/>
+              <w:right w:type="dxa" w:w="120"/>
+            </w:tcMar>
+            <w:vAlign w:val="center"/>
+          </w:tcPr>
+          <w:p>
+            <w:pPr>
+              <w:jc w:val="center"/>
+            </w:pPr>
+            <w:r>
+              <w:rPr>
+                <w:rFonts w:ascii="Arial" w:cs="Arial" w:eastAsia="Arial" w:hAnsi="Arial"/>
+                <w:b/>
+                <w:bCs/>
+                <w:color w:val="1F7023"/>
+                <w:sz w:val="20"/>
+                <w:szCs w:val="20"/>
+              </w:rPr>
+              <w:t xml:space="preserve">✓</w:t>
+            </w:r>
+          </w:p>
+        </w:tc>
+        <w:tc>
+          <w:tcPr>
+            <w:tcW w:type="dxa" w:w="1960"/>
+            <w:tcBorders>
+              <w:top w:val="single" w:color="CCCCCC" w:sz="1"/>
+              <w:left w:val="single" w:color="CCCCCC" w:sz="1"/>
+              <w:bottom w:val="single" w:color="CCCCCC" w:sz="1"/>
+              <w:right w:val="single" w:color="CCCCCC" w:sz="1"/>
+            </w:tcBorders>
+            <w:shd w:fill="DEEAF1" w:val="clear"/>
             <w:tcMar>
               <w:top w:type="dxa" w:w="80"/>
               <w:left w:type="dxa" w:w="120"/>

</xml_diff>